<commit_message>
rebuild the final report in the vit bcse497j template with per-student copies and apa references, add ai annotator labels and licence notes
</commit_message>
<xml_diff>
--- a/report/paper/MedBridge_IEEE_Paper.docx
+++ b/report/paper/MedBridge_IEEE_Paper.docx
@@ -3645,7 +3645,13 @@
         <w:t>Judges.</w:t>
       </w:r>
       <w:r>
-        <w:t xml:space="preserve"> Every result for a gated condition rests on one automatic judge; the NLI judge scored only ungated outputs, and the human labels are pending. The LLM judge labels restated user facts and generic hedges as unsupported, which inflates absolute rates in every condition (paired comparisons are less affected), and template responses count as free of hallucination, so response-level rates mix abstention with grounding. </w:t>
+        <w:t xml:space="preserve"> Every result for a gated condition rests on one automatic judge; the NLI judge scored only ungated outputs, and no human labels were collected; an AI annotator (not a human) agreed only moderately with the LLM judge (κ = </w:t>
+      </w:r>
+      <w:r>
+        <w:t>0.50</w:t>
+      </w:r>
+      <w:r>
+        <w:t xml:space="preserve">) and was stricter. The LLM judge labels restated user facts and generic hedges as unsupported, which inflates absolute rates in every condition (paired comparisons are less affected), and template responses count as free of hallucination, so response-level rates mix abstention with grounding. </w:t>
       </w:r>
       <w:r>
         <w:rPr>

</xml_diff>